<commit_message>
Actualizar los participantes del proyecto: Lucía Garrido Chocarro y Hugo Pérez Muñoz
</commit_message>
<xml_diff>
--- a/Plantila para proyectos EIS Albarregas.docx
+++ b/Plantila para proyectos EIS Albarregas.docx
@@ -3506,23 +3506,19 @@
       <w:pPr>
         <w:spacing w:before="0" w:after="120" w:line="276" w:lineRule="auto"/>
       </w:pPr>
-      <w:r>
-        <w:rPr>
-          <w:rFonts w:ascii="Calibri" w:hAnsi="Calibri"/>
-          <w:b/>
-          <w:color w:val="262626"/>
-          <w:sz w:val="22"/>
+      <w:r/>
+      <w:r>
+        <w:rPr>
+          <w:rFonts w:ascii="Calibri" w:hAnsi="Calibri"/>
+          <w:b/>
         </w:rPr>
         <w:t xml:space="preserve">Participantes: </w:t>
       </w:r>
       <w:r>
         <w:rPr>
           <w:rFonts w:ascii="Calibri" w:hAnsi="Calibri"/>
-          <w:i w:val="0"/>
-          <w:color w:val="262626"/>
-          <w:sz w:val="22"/>
-        </w:rPr>
-        <w:t>Lucía Garrido (Coordinación de Proyecto, Product Owner y Desarrollo Frontend Móvil PWA / Accesibilidad). Equipo de desarrollo del Ciclo Formativo de Grado Superior DAM.</w:t>
+        </w:rPr>
+        <w:t>Lucía Garrido Chocarro (Product Owner, Diseño UI/UX y Desarrollo Frontend Móvil PWA) y Hugo Pérez Muñoz (Arquitectura Backend FastAPI, Base de Datos PostgreSQL, Pipeline OCR/IA y Panel Web Gestoría). Alumnos del C.F.G.S. en Desarrollo de Aplicaciones Multiplataforma (DAM).</w:t>
       </w:r>
     </w:p>
     <w:p>

</xml_diff>

<commit_message>
Integrar el mapa de empatía y su diagrama en la memoria del proyecto
</commit_message>
<xml_diff>
--- a/Plantila para proyectos EIS Albarregas.docx
+++ b/Plantila para proyectos EIS Albarregas.docx
@@ -5968,6 +5968,476 @@
         </w:rPr>
         <w:t>Fase de Análisis</w:t>
       </w:r>
+    </w:p>
+    <w:p>
+      <w:pPr>
+        <w:pStyle w:val="Ttulo2"/>
+        <w:jc w:val="left"/>
+      </w:pPr>
+      <w:r>
+        <w:rPr>
+          <w:rFonts w:ascii="Calibri" w:hAnsi="Calibri"/>
+        </w:rPr>
+        <w:t>Técnicas de Análisis y Empatía de Usuario (Design Thinking: Mapa de Empatía)</w:t>
+      </w:r>
+    </w:p>
+    <w:p>
+      <w:pPr>
+        <w:jc w:val="left"/>
+      </w:pPr>
+      <w:r>
+        <w:rPr>
+          <w:rFonts w:ascii="Calibri" w:hAnsi="Calibri"/>
+        </w:rPr>
+        <w:t>Con el objetivo de fundamentar los requisitos del sistema en problemas y necesidades humanas reales, se ha aplicado la metodología de Design Thinking mediante la construcción del Mapa de Empatía (modelo formal XPLANE). FacturaMétrica opera en un modelo B2B2C donde convergen dos perfiles interdependientes: el profesional autónomo (usuario directo de la app móvil) y el gestor/contable (cliente corporativo del panel web).</w:t>
+      </w:r>
+    </w:p>
+    <w:p>
+      <w:pPr>
+        <w:jc w:val="center"/>
+      </w:pPr>
+      <w:r>
+        <w:drawing>
+          <wp:inline xmlns:a="http://schemas.openxmlformats.org/drawingml/2006/main" xmlns:pic="http://schemas.openxmlformats.org/drawingml/2006/picture">
+            <wp:extent cx="5669280" cy="4195267"/>
+            <wp:docPr id="2086992324" name="Picture 2086992324"/>
+            <wp:cNvGraphicFramePr>
+              <a:graphicFrameLocks noChangeAspect="1"/>
+            </wp:cNvGraphicFramePr>
+            <a:graphic>
+              <a:graphicData uri="http://schemas.openxmlformats.org/drawingml/2006/picture">
+                <pic:pic>
+                  <pic:nvPicPr>
+                    <pic:cNvPr id="0" name="Mapa_de_empatia_FacturaMetrica.png"/>
+                    <pic:cNvPicPr/>
+                  </pic:nvPicPr>
+                  <pic:blipFill>
+                    <a:blip r:embed="rId19"/>
+                    <a:stretch>
+                      <a:fillRect/>
+                    </a:stretch>
+                  </pic:blipFill>
+                  <pic:spPr>
+                    <a:xfrm>
+                      <a:off x="0" y="0"/>
+                      <a:ext cx="5669280" cy="4195267"/>
+                    </a:xfrm>
+                    <a:prstGeom prst="rect"/>
+                  </pic:spPr>
+                </pic:pic>
+              </a:graphicData>
+            </a:graphic>
+          </wp:inline>
+        </w:drawing>
+      </w:r>
+    </w:p>
+    <w:p>
+      <w:pPr>
+        <w:jc w:val="center"/>
+      </w:pPr>
+      <w:r>
+        <w:rPr>
+          <w:i/>
+          <w:color w:val="64748B"/>
+          <w:sz w:val="19"/>
+        </w:rPr>
+        <w:t>Figura 1: Mapa de Empatía del usuario arquetipo (Autónomo / Contribuyente) para FacturaMétrica.</w:t>
+      </w:r>
+    </w:p>
+    <w:p>
+      <w:pPr>
+        <w:jc w:val="left"/>
+      </w:pPr>
+      <w:r>
+        <w:rPr>
+          <w:rFonts w:ascii="Calibri" w:hAnsi="Calibri"/>
+        </w:rPr>
+        <w:t>El desglose detallado de las seis dimensiones del mapa de empatía revela las siguientes conclusiones clave:</w:t>
+      </w:r>
+    </w:p>
+    <w:p>
+      <w:pPr>
+        <w:jc w:val="left"/>
+      </w:pPr>
+      <w:r>
+        <w:rPr>
+          <w:rFonts w:ascii="Calibri" w:hAnsi="Calibri"/>
+          <w:b/>
+        </w:rPr>
+        <w:t>• 1. ¿Qué Piensa y Siente? (Inquietudes y aspiraciones):</w:t>
+      </w:r>
+      <w:r>
+        <w:rPr>
+          <w:rFonts w:ascii="Calibri" w:hAnsi="Calibri"/>
+        </w:rPr>
+        <w:t xml:space="preserve"> El autónomo vive enfocado en generar negocio y atender clientes. La recopilación manual de comprobantes le produce una profunda aversión burocrática. Su mayor inquietud es el miedo a sanciones de la Agencia Tributaria (AEAT) por deducir gastos en fines de semana o suministros sin saber si cumplen los criterios normativos de la LIRPF. Aspira a la tranquilidad total y al control sin fricciones.</w:t>
+      </w:r>
+    </w:p>
+    <w:p>
+      <w:pPr>
+        <w:jc w:val="left"/>
+      </w:pPr>
+      <w:r>
+        <w:rPr>
+          <w:rFonts w:ascii="Calibri" w:hAnsi="Calibri"/>
+          <w:b/>
+        </w:rPr>
+        <w:t>• 2. ¿Qué Oye? (Influencias y entorno):</w:t>
+      </w:r>
+      <w:r>
+        <w:rPr>
+          <w:rFonts w:ascii="Calibri" w:hAnsi="Calibri"/>
+        </w:rPr>
+        <w:t xml:space="preserve"> Escucha continuamente a su asesor recordándole la obligación de aportar facturas completas antes del día 15 y advirtiéndole de que los tickets simplificados o no justificados acarrearán inspecciones. En su entorno profesional escucha anécdotas de inspecciones paralelas y noticias sobre la implantación de la Ley Antifraude y el sistema Veri*Factu.</w:t>
+      </w:r>
+    </w:p>
+    <w:p>
+      <w:pPr>
+        <w:jc w:val="left"/>
+      </w:pPr>
+      <w:r>
+        <w:rPr>
+          <w:rFonts w:ascii="Calibri" w:hAnsi="Calibri"/>
+          <w:b/>
+        </w:rPr>
+        <w:t>• 3. ¿Qué Ve? (Realidad física y oferta de mercado):</w:t>
+      </w:r>
+      <w:r>
+        <w:rPr>
+          <w:rFonts w:ascii="Calibri" w:hAnsi="Calibri"/>
+        </w:rPr>
+        <w:t xml:space="preserve"> En su día a día observa tickets de papel térmico acumulados en la guantera del vehículo o carteras, cuya tinta se borra antes del cierre de trimestre. En el mercado observa herramientas contables excesivamente densas o aplicaciones de escaneo que no aportan ningún valor fiscal preventivo.</w:t>
+      </w:r>
+    </w:p>
+    <w:p>
+      <w:pPr>
+        <w:jc w:val="left"/>
+      </w:pPr>
+      <w:r>
+        <w:rPr>
+          <w:rFonts w:ascii="Calibri" w:hAnsi="Calibri"/>
+          <w:b/>
+        </w:rPr>
+        <w:t>• 4. ¿Qué Dice y Hace? (Conducta y hábitos cotidianos):</w:t>
+      </w:r>
+      <w:r>
+        <w:rPr>
+          <w:rFonts w:ascii="Calibri" w:hAnsi="Calibri"/>
+        </w:rPr>
+        <w:t xml:space="preserve"> En restaurantes y comercios pide el ticket con prisa con la promesa de revisarlo más tarde, olvidándolo con frecuencia. En vísperas del cierre trimestral (enero, abril, julio, octubre) sufre fines de semana maratonianos buscando comprobantes y enviando fotografías torcidas por WhatsApp a su despacho contable.</w:t>
+      </w:r>
+    </w:p>
+    <w:p>
+      <w:pPr>
+        <w:jc w:val="left"/>
+      </w:pPr>
+      <w:r>
+        <w:rPr>
+          <w:rFonts w:ascii="Calibri" w:hAnsi="Calibri"/>
+          <w:b/>
+        </w:rPr>
+        <w:t>• 5. Esfuerzos (Frustraciones, dolores y barreras):</w:t>
+      </w:r>
+      <w:r>
+        <w:rPr>
+          <w:rFonts w:ascii="Calibri" w:hAnsi="Calibri"/>
+        </w:rPr>
+        <w:t xml:space="preserve"> Pánico a requerimientos tributarios, liquidaciones paralelas y recargos por deducciones denegadas; pérdida directa de dinero al no deducir gastos legítimos extraviados o descoloridos; y tensiones recurrentes con su gestor debido a envíos tardíos e incompletos.</w:t>
+      </w:r>
+    </w:p>
+    <w:p>
+      <w:pPr>
+        <w:jc w:val="left"/>
+      </w:pPr>
+      <w:r>
+        <w:rPr>
+          <w:rFonts w:ascii="Calibri" w:hAnsi="Calibri"/>
+          <w:b/>
+        </w:rPr>
+        <w:t>• 6. Resultados (Deseos de éxito y beneficios alcanzados):</w:t>
+      </w:r>
+      <w:r>
+        <w:rPr>
+          <w:rFonts w:ascii="Calibri" w:hAnsi="Calibri"/>
+        </w:rPr>
+        <w:t xml:space="preserve"> Captura inmediata en 3 segundos desde el smartphone con OCR instantáneo; asistencia fiscal interactiva ('Asesor Fiscal Virtual') que le avisa en el instante preciso para justificar gastos de riesgo; y paz mental derivada de saber que sus comprobantes están validados y volcados a la contabilidad del despacho.</w:t>
+      </w:r>
+    </w:p>
+    <w:p>
+      <w:pPr>
+        <w:jc w:val="left"/>
+      </w:pPr>
+      <w:r>
+        <w:rPr>
+          <w:rFonts w:ascii="Calibri" w:hAnsi="Calibri"/>
+          <w:b/>
+        </w:rPr>
+        <w:t xml:space="preserve">Tabla de Alineamiento: </w:t>
+      </w:r>
+      <w:r>
+        <w:rPr>
+          <w:rFonts w:ascii="Calibri" w:hAnsi="Calibri"/>
+        </w:rPr>
+        <w:t>Matriz de Trazabilidad: De los Puntos de Dolor (Esfuerzos) a los Requisitos del Sistema</w:t>
+      </w:r>
+    </w:p>
+    <w:tbl>
+      <w:tblPr>
+        <w:tblW w:type="auto" w:w="0"/>
+        <w:jc w:val="center"/>
+        <w:tblLook w:firstColumn="1" w:firstRow="1" w:lastColumn="0" w:lastRow="0" w:noHBand="0" w:noVBand="1" w:val="04A0"/>
+      </w:tblPr>
+      <w:tblGrid>
+        <w:gridCol w:w="2835"/>
+        <w:gridCol w:w="2835"/>
+        <w:gridCol w:w="2835"/>
+      </w:tblGrid>
+      <w:tr>
+        <w:tc>
+          <w:tcPr>
+            <w:tcW w:type="dxa" w:w="2835"/>
+            <w:shd w:val="clear" w:color="auto" w:fill="1E293B"/>
+          </w:tcPr>
+          <w:p>
+            <w:r>
+              <w:rPr>
+                <w:rFonts w:ascii="Calibri" w:hAnsi="Calibri"/>
+                <w:b/>
+                <w:color w:val="FFFFFF"/>
+                <w:sz w:val="19"/>
+              </w:rPr>
+              <w:t>Dimensión / Dolor Detectado (Design Thinking)</w:t>
+            </w:r>
+          </w:p>
+        </w:tc>
+        <w:tc>
+          <w:tcPr>
+            <w:tcW w:type="dxa" w:w="2835"/>
+            <w:shd w:val="clear" w:color="auto" w:fill="1E293B"/>
+          </w:tcPr>
+          <w:p>
+            <w:r>
+              <w:rPr>
+                <w:rFonts w:ascii="Calibri" w:hAnsi="Calibri"/>
+                <w:b/>
+                <w:color w:val="FFFFFF"/>
+                <w:sz w:val="19"/>
+              </w:rPr>
+              <w:t>Respuesta de FacturaMétrica</w:t>
+            </w:r>
+          </w:p>
+        </w:tc>
+        <w:tc>
+          <w:tcPr>
+            <w:tcW w:type="dxa" w:w="2835"/>
+            <w:shd w:val="clear" w:color="auto" w:fill="1E293B"/>
+          </w:tcPr>
+          <w:p>
+            <w:r>
+              <w:rPr>
+                <w:rFonts w:ascii="Calibri" w:hAnsi="Calibri"/>
+                <w:b/>
+                <w:color w:val="FFFFFF"/>
+                <w:sz w:val="19"/>
+              </w:rPr>
+              <w:t>Requisito Asociado</w:t>
+            </w:r>
+          </w:p>
+        </w:tc>
+      </w:tr>
+      <w:tr>
+        <w:tc>
+          <w:tcPr>
+            <w:tcW w:type="dxa" w:w="2835"/>
+            <w:shd w:val="clear" w:color="auto" w:fill="F1F5F9"/>
+          </w:tcPr>
+          <w:p>
+            <w:r>
+              <w:rPr>
+                <w:rFonts w:ascii="Calibri" w:hAnsi="Calibri"/>
+                <w:sz w:val="18"/>
+              </w:rPr>
+              <w:t>Miedo a sanciones e inspecciones de la AEAT por deducir gastos de fin de semana o comidas no acreditadas.</w:t>
+            </w:r>
+          </w:p>
+        </w:tc>
+        <w:tc>
+          <w:tcPr>
+            <w:tcW w:type="dxa" w:w="2835"/>
+            <w:shd w:val="clear" w:color="auto" w:fill="F1F5F9"/>
+          </w:tcPr>
+          <w:p>
+            <w:r>
+              <w:rPr>
+                <w:rFonts w:ascii="Calibri" w:hAnsi="Calibri"/>
+                <w:sz w:val="18"/>
+              </w:rPr>
+              <w:t>Asesor Fiscal Virtual con semáforo preventivo que detecta horarios atípicos y solicita justificación contextual inmediata.</w:t>
+            </w:r>
+          </w:p>
+        </w:tc>
+        <w:tc>
+          <w:tcPr>
+            <w:tcW w:type="dxa" w:w="2835"/>
+            <w:shd w:val="clear" w:color="auto" w:fill="F1F5F9"/>
+          </w:tcPr>
+          <w:p>
+            <w:r>
+              <w:rPr>
+                <w:rFonts w:ascii="Calibri" w:hAnsi="Calibri"/>
+                <w:sz w:val="18"/>
+              </w:rPr>
+              <w:t>RF-03, RF-04</w:t>
+              <w:br/>
+              <w:t>(Validación Contextual)</w:t>
+            </w:r>
+          </w:p>
+        </w:tc>
+      </w:tr>
+      <w:tr>
+        <w:tc>
+          <w:tcPr>
+            <w:tcW w:type="dxa" w:w="2835"/>
+          </w:tcPr>
+          <w:p>
+            <w:r>
+              <w:rPr>
+                <w:rFonts w:ascii="Calibri" w:hAnsi="Calibri"/>
+                <w:sz w:val="18"/>
+              </w:rPr>
+              <w:t>Pérdida de comprobantes en papel térmico borrados por calor o extraviados en carteras.</w:t>
+            </w:r>
+          </w:p>
+        </w:tc>
+        <w:tc>
+          <w:tcPr>
+            <w:tcW w:type="dxa" w:w="2835"/>
+          </w:tcPr>
+          <w:p>
+            <w:r>
+              <w:rPr>
+                <w:rFonts w:ascii="Calibri" w:hAnsi="Calibri"/>
+                <w:sz w:val="18"/>
+              </w:rPr>
+              <w:t>Captura fotográfica inmediata en 3 segundos con almacenamiento seguro en la nube y repositorio documental indexado.</w:t>
+            </w:r>
+          </w:p>
+        </w:tc>
+        <w:tc>
+          <w:tcPr>
+            <w:tcW w:type="dxa" w:w="2835"/>
+          </w:tcPr>
+          <w:p>
+            <w:r>
+              <w:rPr>
+                <w:rFonts w:ascii="Calibri" w:hAnsi="Calibri"/>
+                <w:sz w:val="18"/>
+              </w:rPr>
+              <w:t>RF-01, RF-12</w:t>
+              <w:br/>
+              <w:t>(Captura &amp; Repositorio)</w:t>
+            </w:r>
+          </w:p>
+        </w:tc>
+      </w:tr>
+      <w:tr>
+        <w:tc>
+          <w:tcPr>
+            <w:tcW w:type="dxa" w:w="2835"/>
+            <w:shd w:val="clear" w:color="auto" w:fill="F1F5F9"/>
+          </w:tcPr>
+          <w:p>
+            <w:r>
+              <w:rPr>
+                <w:rFonts w:ascii="Calibri" w:hAnsi="Calibri"/>
+                <w:sz w:val="18"/>
+              </w:rPr>
+              <w:t>Pérdida de horas de trabajo en cierres trimestrales y envío caótico de fotos por WhatsApp.</w:t>
+            </w:r>
+          </w:p>
+        </w:tc>
+        <w:tc>
+          <w:tcPr>
+            <w:tcW w:type="dxa" w:w="2835"/>
+            <w:shd w:val="clear" w:color="auto" w:fill="F1F5F9"/>
+          </w:tcPr>
+          <w:p>
+            <w:r>
+              <w:rPr>
+                <w:rFonts w:ascii="Calibri" w:hAnsi="Calibri"/>
+                <w:sz w:val="18"/>
+              </w:rPr>
+              <w:t>Sincronización automática con el panel del gestor, clasificación semafórica y aprobación de criterios en 1 solo clic.</w:t>
+            </w:r>
+          </w:p>
+        </w:tc>
+        <w:tc>
+          <w:tcPr>
+            <w:tcW w:type="dxa" w:w="2835"/>
+            <w:shd w:val="clear" w:color="auto" w:fill="F1F5F9"/>
+          </w:tcPr>
+          <w:p>
+            <w:r>
+              <w:rPr>
+                <w:rFonts w:ascii="Calibri" w:hAnsi="Calibri"/>
+                <w:sz w:val="18"/>
+              </w:rPr>
+              <w:t>RF-05, RF-06</w:t>
+              <w:br/>
+              <w:t>(Bandeja Gestor)</w:t>
+            </w:r>
+          </w:p>
+        </w:tc>
+      </w:tr>
+      <w:tr>
+        <w:tc>
+          <w:tcPr>
+            <w:tcW w:type="dxa" w:w="2835"/>
+          </w:tcPr>
+          <w:p>
+            <w:r>
+              <w:rPr>
+                <w:rFonts w:ascii="Calibri" w:hAnsi="Calibri"/>
+                <w:sz w:val="18"/>
+              </w:rPr>
+              <w:t>Sobrecarga del contable picando datos a mano en su programa de contabilidad (A3, Sage, Wolters).</w:t>
+            </w:r>
+          </w:p>
+        </w:tc>
+        <w:tc>
+          <w:tcPr>
+            <w:tcW w:type="dxa" w:w="2835"/>
+          </w:tcPr>
+          <w:p>
+            <w:r>
+              <w:rPr>
+                <w:rFonts w:ascii="Calibri" w:hAnsi="Calibri"/>
+                <w:sz w:val="18"/>
+              </w:rPr>
+              <w:t>Asignación automática de subcuentas del PGC (629) y exportación directa de ficheros estructurados.</w:t>
+            </w:r>
+          </w:p>
+        </w:tc>
+        <w:tc>
+          <w:tcPr>
+            <w:tcW w:type="dxa" w:w="2835"/>
+          </w:tcPr>
+          <w:p>
+            <w:r>
+              <w:rPr>
+                <w:rFonts w:ascii="Calibri" w:hAnsi="Calibri"/>
+                <w:sz w:val="18"/>
+              </w:rPr>
+              <w:t>RF-07, RF-08</w:t>
+              <w:br/>
+              <w:t>(Integración ERP)</w:t>
+            </w:r>
+          </w:p>
+        </w:tc>
+      </w:tr>
+    </w:tbl>
+    <w:p>
+      <w:r/>
     </w:p>
     <w:p>
       <w:pPr>

</xml_diff>

<commit_message>
Completar la portada oficial, el resumen ejecutivo, el índice y el mapa de empatía de la memoria
</commit_message>
<xml_diff>
--- a/Plantila para proyectos EIS Albarregas.docx
+++ b/Plantila para proyectos EIS Albarregas.docx
@@ -3242,6 +3242,1882 @@
         </w:p>
       </w:sdtContent>
     </w:sdt>
+    <w:p>
+      <w:pPr>
+        <w:spacing w:before="200" w:after="40"/>
+        <w:jc w:val="center"/>
+      </w:pPr>
+      <w:r>
+        <w:rPr>
+          <w:rFonts w:ascii="Calibri" w:hAnsi="Calibri"/>
+          <w:b/>
+          <w:i w:val="0"/>
+          <w:color w:val="0F172A"/>
+          <w:sz w:val="26"/>
+        </w:rPr>
+        <w:t>JUNTA DE EXTREMADURA</w:t>
+        <w:br/>
+      </w:r>
+      <w:r>
+        <w:rPr>
+          <w:rFonts w:ascii="Calibri" w:hAnsi="Calibri"/>
+          <w:b/>
+          <w:i w:val="0"/>
+          <w:color w:val="475569"/>
+          <w:sz w:val="21"/>
+        </w:rPr>
+        <w:t>CONSEJERÍA DE EDUCACIÓN, CIENCIA Y FORMACIÓN PROFESIONAL</w:t>
+        <w:br/>
+      </w:r>
+      <w:r>
+        <w:rPr>
+          <w:rFonts w:ascii="Calibri" w:hAnsi="Calibri"/>
+          <w:b/>
+          <w:i w:val="0"/>
+          <w:color w:val="2563EB"/>
+          <w:sz w:val="22"/>
+        </w:rPr>
+        <w:t>I.E.S. ALBARREGAS · MÉRIDA (BADAJOZ)</w:t>
+        <w:br/>
+      </w:r>
+      <w:r>
+        <w:rPr>
+          <w:rFonts w:ascii="Calibri" w:hAnsi="Calibri"/>
+          <w:b w:val="0"/>
+          <w:i w:val="0"/>
+          <w:color w:val="64748B"/>
+          <w:sz w:val="20"/>
+        </w:rPr>
+        <w:t>DEPARTAMENTO DE INFORMÁTICA Y COMUNICACIONES</w:t>
+      </w:r>
+    </w:p>
+    <w:p>
+      <w:pPr>
+        <w:spacing w:before="280" w:after="0"/>
+        <w:jc w:val="left"/>
+      </w:pPr>
+    </w:p>
+    <w:p>
+      <w:pPr>
+        <w:spacing w:before="0" w:after="120"/>
+        <w:jc w:val="center"/>
+      </w:pPr>
+      <w:r>
+        <w:rPr>
+          <w:rFonts w:ascii="Calibri" w:hAnsi="Calibri"/>
+          <w:b/>
+          <w:i w:val="0"/>
+          <w:color w:val="1E3A8A"/>
+          <w:sz w:val="64"/>
+        </w:rPr>
+        <w:t>FACTURAMÉTRICA</w:t>
+      </w:r>
+    </w:p>
+    <w:p>
+      <w:pPr>
+        <w:spacing w:before="0" w:after="120"/>
+        <w:jc w:val="center"/>
+      </w:pPr>
+      <w:r>
+        <w:rPr>
+          <w:rFonts w:ascii="Calibri" w:hAnsi="Calibri"/>
+          <w:b w:val="0"/>
+          <w:i/>
+          <w:color w:val="334155"/>
+          <w:sz w:val="25"/>
+        </w:rPr>
+        <w:t>Sistema B2B2C de Digitalización, Extracción OCR y Filtro Fiscal Preventivo de Gastos para Asesorías y Autónomos</w:t>
+      </w:r>
+    </w:p>
+    <w:p>
+      <w:pPr>
+        <w:spacing w:before="0" w:after="400"/>
+        <w:jc w:val="center"/>
+      </w:pPr>
+      <w:r>
+        <w:rPr>
+          <w:rFonts w:ascii="Calibri" w:hAnsi="Calibri"/>
+          <w:b/>
+          <w:i w:val="0"/>
+          <w:color w:val="10B981"/>
+          <w:sz w:val="21"/>
+        </w:rPr>
+        <w:t>«El filtro fiscal preventivo inteligente que conecta al autónomo con su despacho contable»</w:t>
+      </w:r>
+    </w:p>
+    <w:tbl>
+      <w:tblPr>
+        <w:tblW w:type="auto" w:w="0"/>
+        <w:jc w:val="center"/>
+        <w:tblLook w:firstColumn="1" w:firstRow="1" w:lastColumn="0" w:lastRow="0" w:noHBand="0" w:noVBand="1" w:val="04A0"/>
+      </w:tblPr>
+      <w:tblGrid>
+        <w:gridCol w:w="4252"/>
+        <w:gridCol w:w="4252"/>
+      </w:tblGrid>
+      <w:tr>
+        <w:tc>
+          <w:tcPr>
+            <w:tcW w:type="dxa" w:w="3168"/>
+          </w:tcPr>
+          <w:p>
+            <w:pPr>
+              <w:spacing w:after="60"/>
+              <w:jc w:val="right"/>
+            </w:pPr>
+            <w:r>
+              <w:rPr>
+                <w:rFonts w:ascii="Calibri" w:hAnsi="Calibri"/>
+                <w:b/>
+                <w:color w:val="0F172A"/>
+                <w:sz w:val="19"/>
+              </w:rPr>
+              <w:t>Ciclo Formativo:</w:t>
+            </w:r>
+          </w:p>
+        </w:tc>
+        <w:tc>
+          <w:tcPr>
+            <w:tcW w:type="dxa" w:w="6192"/>
+          </w:tcPr>
+          <w:p>
+            <w:pPr>
+              <w:spacing w:after="60"/>
+              <w:jc w:val="left"/>
+            </w:pPr>
+            <w:r>
+              <w:rPr>
+                <w:rFonts w:ascii="Calibri" w:hAnsi="Calibri"/>
+                <w:color w:val="475569"/>
+                <w:sz w:val="19"/>
+              </w:rPr>
+              <w:t>C.F.G.S. Desarrollo de Aplicaciones Multiplataforma (DAM)</w:t>
+            </w:r>
+          </w:p>
+        </w:tc>
+      </w:tr>
+      <w:tr>
+        <w:tc>
+          <w:tcPr>
+            <w:tcW w:type="dxa" w:w="3168"/>
+          </w:tcPr>
+          <w:p>
+            <w:pPr>
+              <w:spacing w:after="60"/>
+              <w:jc w:val="right"/>
+            </w:pPr>
+            <w:r>
+              <w:rPr>
+                <w:rFonts w:ascii="Calibri" w:hAnsi="Calibri"/>
+                <w:b/>
+                <w:color w:val="0F172A"/>
+                <w:sz w:val="19"/>
+              </w:rPr>
+              <w:t>Módulo Profesional:</w:t>
+            </w:r>
+          </w:p>
+        </w:tc>
+        <w:tc>
+          <w:tcPr>
+            <w:tcW w:type="dxa" w:w="6192"/>
+          </w:tcPr>
+          <w:p>
+            <w:pPr>
+              <w:spacing w:after="60"/>
+              <w:jc w:val="left"/>
+            </w:pPr>
+            <w:r>
+              <w:rPr>
+                <w:rFonts w:ascii="Calibri" w:hAnsi="Calibri"/>
+                <w:color w:val="475569"/>
+                <w:sz w:val="19"/>
+              </w:rPr>
+              <w:t>Proyecto de Desarrollo de Aplicaciones Multiplataforma (Código: DAM-PRJ)</w:t>
+            </w:r>
+          </w:p>
+        </w:tc>
+      </w:tr>
+      <w:tr>
+        <w:tc>
+          <w:tcPr>
+            <w:tcW w:type="dxa" w:w="3168"/>
+          </w:tcPr>
+          <w:p>
+            <w:pPr>
+              <w:spacing w:after="60"/>
+              <w:jc w:val="right"/>
+            </w:pPr>
+            <w:r>
+              <w:rPr>
+                <w:rFonts w:ascii="Calibri" w:hAnsi="Calibri"/>
+                <w:b/>
+                <w:color w:val="0F172A"/>
+                <w:sz w:val="19"/>
+              </w:rPr>
+              <w:t>Autora / Alumna:</w:t>
+            </w:r>
+          </w:p>
+        </w:tc>
+        <w:tc>
+          <w:tcPr>
+            <w:tcW w:type="dxa" w:w="6192"/>
+          </w:tcPr>
+          <w:p>
+            <w:pPr>
+              <w:spacing w:after="60"/>
+              <w:jc w:val="left"/>
+            </w:pPr>
+            <w:r>
+              <w:rPr>
+                <w:rFonts w:ascii="Calibri" w:hAnsi="Calibri"/>
+                <w:color w:val="475569"/>
+                <w:sz w:val="19"/>
+              </w:rPr>
+              <w:t>Lucía Garrido Chocarro (Product Owner &amp; Frontend PWA)</w:t>
+            </w:r>
+          </w:p>
+        </w:tc>
+      </w:tr>
+      <w:tr>
+        <w:tc>
+          <w:tcPr>
+            <w:tcW w:type="dxa" w:w="3168"/>
+          </w:tcPr>
+          <w:p>
+            <w:pPr>
+              <w:spacing w:after="60"/>
+              <w:jc w:val="right"/>
+            </w:pPr>
+            <w:r>
+              <w:rPr>
+                <w:rFonts w:ascii="Calibri" w:hAnsi="Calibri"/>
+                <w:b/>
+                <w:color w:val="0F172A"/>
+                <w:sz w:val="19"/>
+              </w:rPr>
+              <w:t>Equipo Colaborador:</w:t>
+            </w:r>
+          </w:p>
+        </w:tc>
+        <w:tc>
+          <w:tcPr>
+            <w:tcW w:type="dxa" w:w="6192"/>
+          </w:tcPr>
+          <w:p>
+            <w:pPr>
+              <w:spacing w:after="60"/>
+              <w:jc w:val="left"/>
+            </w:pPr>
+            <w:r>
+              <w:rPr>
+                <w:rFonts w:ascii="Calibri" w:hAnsi="Calibri"/>
+                <w:color w:val="475569"/>
+                <w:sz w:val="19"/>
+              </w:rPr>
+              <w:t>Hugo Pérez Muñoz (Backend FastAPI, Base de Datos &amp; Pipeline OCR)</w:t>
+            </w:r>
+          </w:p>
+        </w:tc>
+      </w:tr>
+      <w:tr>
+        <w:tc>
+          <w:tcPr>
+            <w:tcW w:type="dxa" w:w="3168"/>
+          </w:tcPr>
+          <w:p>
+            <w:pPr>
+              <w:spacing w:after="60"/>
+              <w:jc w:val="right"/>
+            </w:pPr>
+            <w:r>
+              <w:rPr>
+                <w:rFonts w:ascii="Calibri" w:hAnsi="Calibri"/>
+                <w:b/>
+                <w:color w:val="0F172A"/>
+                <w:sz w:val="19"/>
+              </w:rPr>
+              <w:t>Tutor del Proyecto:</w:t>
+            </w:r>
+          </w:p>
+        </w:tc>
+        <w:tc>
+          <w:tcPr>
+            <w:tcW w:type="dxa" w:w="6192"/>
+          </w:tcPr>
+          <w:p>
+            <w:pPr>
+              <w:spacing w:after="60"/>
+              <w:jc w:val="left"/>
+            </w:pPr>
+            <w:r>
+              <w:rPr>
+                <w:rFonts w:ascii="Calibri" w:hAnsi="Calibri"/>
+                <w:color w:val="475569"/>
+                <w:sz w:val="19"/>
+              </w:rPr>
+              <w:t>Profesorado del Dpto. de Informática y Comunicaciones (IES Albarregas)</w:t>
+            </w:r>
+          </w:p>
+        </w:tc>
+      </w:tr>
+      <w:tr>
+        <w:tc>
+          <w:tcPr>
+            <w:tcW w:type="dxa" w:w="3168"/>
+          </w:tcPr>
+          <w:p>
+            <w:pPr>
+              <w:spacing w:after="60"/>
+              <w:jc w:val="right"/>
+            </w:pPr>
+            <w:r>
+              <w:rPr>
+                <w:rFonts w:ascii="Calibri" w:hAnsi="Calibri"/>
+                <w:b/>
+                <w:color w:val="0F172A"/>
+                <w:sz w:val="19"/>
+              </w:rPr>
+              <w:t>Convocatoria &amp; Curso:</w:t>
+            </w:r>
+          </w:p>
+        </w:tc>
+        <w:tc>
+          <w:tcPr>
+            <w:tcW w:type="dxa" w:w="6192"/>
+          </w:tcPr>
+          <w:p>
+            <w:pPr>
+              <w:spacing w:after="60"/>
+              <w:jc w:val="left"/>
+            </w:pPr>
+            <w:r>
+              <w:rPr>
+                <w:rFonts w:ascii="Calibri" w:hAnsi="Calibri"/>
+                <w:color w:val="475569"/>
+                <w:sz w:val="19"/>
+              </w:rPr>
+              <w:t>Convocatoria Ordinaria · Curso Académico 2025 / 2026 · Mérida (Badajoz)</w:t>
+            </w:r>
+          </w:p>
+        </w:tc>
+      </w:tr>
+    </w:tbl>
+    <w:p>
+      <w:r>
+        <w:br w:type="page"/>
+      </w:r>
+    </w:p>
+    <w:p>
+      <w:pPr>
+        <w:spacing w:before="240" w:after="200"/>
+        <w:jc w:val="left"/>
+      </w:pPr>
+      <w:r>
+        <w:rPr>
+          <w:rFonts w:ascii="Calibri" w:hAnsi="Calibri"/>
+          <w:b/>
+          <w:i w:val="0"/>
+          <w:color w:val="1E3A8A"/>
+          <w:sz w:val="32"/>
+        </w:rPr>
+        <w:t>Ficha Técnica y Metadatos del Proyecto</w:t>
+      </w:r>
+    </w:p>
+    <w:tbl>
+      <w:tblPr>
+        <w:tblW w:type="auto" w:w="0"/>
+        <w:jc w:val="center"/>
+        <w:tblLook w:firstColumn="1" w:firstRow="1" w:lastColumn="0" w:lastRow="0" w:noHBand="0" w:noVBand="1" w:val="04A0"/>
+      </w:tblPr>
+      <w:tblGrid>
+        <w:gridCol w:w="4252"/>
+        <w:gridCol w:w="4252"/>
+      </w:tblGrid>
+      <w:tr>
+        <w:tc>
+          <w:tcPr>
+            <w:tcW w:type="dxa" w:w="3312"/>
+            <w:shd w:val="clear" w:color="auto" w:fill="F1F5F9"/>
+          </w:tcPr>
+          <w:p>
+            <w:pPr>
+              <w:spacing w:after="60"/>
+            </w:pPr>
+            <w:r>
+              <w:rPr>
+                <w:rFonts w:ascii="Calibri" w:hAnsi="Calibri"/>
+                <w:b/>
+                <w:color w:val="1E293B"/>
+                <w:sz w:val="18"/>
+              </w:rPr>
+              <w:t>Denominación del Proyecto</w:t>
+            </w:r>
+          </w:p>
+        </w:tc>
+        <w:tc>
+          <w:tcPr>
+            <w:tcW w:type="dxa" w:w="6048"/>
+          </w:tcPr>
+          <w:p>
+            <w:pPr>
+              <w:spacing w:after="60"/>
+            </w:pPr>
+            <w:r>
+              <w:rPr>
+                <w:rFonts w:ascii="Calibri" w:hAnsi="Calibri"/>
+                <w:color w:val="475569"/>
+                <w:sz w:val="18"/>
+              </w:rPr>
+              <w:t>FacturaMétrica (Código Oficial: DAM-ALB-2026-FM01)</w:t>
+            </w:r>
+          </w:p>
+        </w:tc>
+      </w:tr>
+      <w:tr>
+        <w:tc>
+          <w:tcPr>
+            <w:tcW w:type="dxa" w:w="3312"/>
+            <w:shd w:val="clear" w:color="auto" w:fill="F1F5F9"/>
+          </w:tcPr>
+          <w:p>
+            <w:pPr>
+              <w:spacing w:after="60"/>
+            </w:pPr>
+            <w:r>
+              <w:rPr>
+                <w:rFonts w:ascii="Calibri" w:hAnsi="Calibri"/>
+                <w:b/>
+                <w:color w:val="1E293B"/>
+                <w:sz w:val="18"/>
+              </w:rPr>
+              <w:t>Ciclo y Familia Profesional</w:t>
+            </w:r>
+          </w:p>
+        </w:tc>
+        <w:tc>
+          <w:tcPr>
+            <w:tcW w:type="dxa" w:w="6048"/>
+          </w:tcPr>
+          <w:p>
+            <w:pPr>
+              <w:spacing w:after="60"/>
+            </w:pPr>
+            <w:r>
+              <w:rPr>
+                <w:rFonts w:ascii="Calibri" w:hAnsi="Calibri"/>
+                <w:color w:val="475569"/>
+                <w:sz w:val="18"/>
+              </w:rPr>
+              <w:t>Desarrollo de Aplicaciones Multiplataforma · Informática y Comunicaciones</w:t>
+            </w:r>
+          </w:p>
+        </w:tc>
+      </w:tr>
+      <w:tr>
+        <w:tc>
+          <w:tcPr>
+            <w:tcW w:type="dxa" w:w="3312"/>
+            <w:shd w:val="clear" w:color="auto" w:fill="F1F5F9"/>
+          </w:tcPr>
+          <w:p>
+            <w:pPr>
+              <w:spacing w:after="60"/>
+            </w:pPr>
+            <w:r>
+              <w:rPr>
+                <w:rFonts w:ascii="Calibri" w:hAnsi="Calibri"/>
+                <w:b/>
+                <w:color w:val="1E293B"/>
+                <w:sz w:val="18"/>
+              </w:rPr>
+              <w:t>Centro Educativo y Sede</w:t>
+            </w:r>
+          </w:p>
+        </w:tc>
+        <w:tc>
+          <w:tcPr>
+            <w:tcW w:type="dxa" w:w="6048"/>
+          </w:tcPr>
+          <w:p>
+            <w:pPr>
+              <w:spacing w:after="60"/>
+            </w:pPr>
+            <w:r>
+              <w:rPr>
+                <w:rFonts w:ascii="Calibri" w:hAnsi="Calibri"/>
+                <w:color w:val="475569"/>
+                <w:sz w:val="18"/>
+              </w:rPr>
+              <w:t>IES Albarregas (Código: 06006692) · Mérida, Badajoz (Extremadura)</w:t>
+            </w:r>
+          </w:p>
+        </w:tc>
+      </w:tr>
+      <w:tr>
+        <w:tc>
+          <w:tcPr>
+            <w:tcW w:type="dxa" w:w="3312"/>
+            <w:shd w:val="clear" w:color="auto" w:fill="F1F5F9"/>
+          </w:tcPr>
+          <w:p>
+            <w:pPr>
+              <w:spacing w:after="60"/>
+            </w:pPr>
+            <w:r>
+              <w:rPr>
+                <w:rFonts w:ascii="Calibri" w:hAnsi="Calibri"/>
+                <w:b/>
+                <w:color w:val="1E293B"/>
+                <w:sz w:val="18"/>
+              </w:rPr>
+              <w:t>Pila Tecnológica Principal</w:t>
+            </w:r>
+          </w:p>
+        </w:tc>
+        <w:tc>
+          <w:tcPr>
+            <w:tcW w:type="dxa" w:w="6048"/>
+          </w:tcPr>
+          <w:p>
+            <w:pPr>
+              <w:spacing w:after="60"/>
+            </w:pPr>
+            <w:r>
+              <w:rPr>
+                <w:rFonts w:ascii="Calibri" w:hAnsi="Calibri"/>
+                <w:color w:val="475569"/>
+                <w:sz w:val="18"/>
+              </w:rPr>
+              <w:t>React 18, TypeScript, Tailwind CSS, Python 3.11+, FastAPI, PostgreSQL 15, Docker</w:t>
+            </w:r>
+          </w:p>
+        </w:tc>
+      </w:tr>
+      <w:tr>
+        <w:tc>
+          <w:tcPr>
+            <w:tcW w:type="dxa" w:w="3312"/>
+            <w:shd w:val="clear" w:color="auto" w:fill="F1F5F9"/>
+          </w:tcPr>
+          <w:p>
+            <w:pPr>
+              <w:spacing w:after="60"/>
+            </w:pPr>
+            <w:r>
+              <w:rPr>
+                <w:rFonts w:ascii="Calibri" w:hAnsi="Calibri"/>
+                <w:b/>
+                <w:color w:val="1E293B"/>
+                <w:sz w:val="18"/>
+              </w:rPr>
+              <w:t>Ámbito y Modelo de Negocio</w:t>
+            </w:r>
+          </w:p>
+        </w:tc>
+        <w:tc>
+          <w:tcPr>
+            <w:tcW w:type="dxa" w:w="6048"/>
+          </w:tcPr>
+          <w:p>
+            <w:pPr>
+              <w:spacing w:after="60"/>
+            </w:pPr>
+            <w:r>
+              <w:rPr>
+                <w:rFonts w:ascii="Calibri" w:hAnsi="Calibri"/>
+                <w:color w:val="475569"/>
+                <w:sz w:val="18"/>
+              </w:rPr>
+              <w:t>B2B2C Software as a Service (SaaS) para Asesorías Fiscales y Autónomos</w:t>
+            </w:r>
+          </w:p>
+        </w:tc>
+      </w:tr>
+    </w:tbl>
+    <w:p>
+      <w:pPr>
+        <w:spacing w:before="240" w:after="0"/>
+        <w:jc w:val="left"/>
+      </w:pPr>
+    </w:p>
+    <w:p>
+      <w:pPr>
+        <w:spacing w:before="120" w:after="80"/>
+        <w:jc w:val="left"/>
+      </w:pPr>
+      <w:r>
+        <w:rPr>
+          <w:rFonts w:ascii="Calibri" w:hAnsi="Calibri"/>
+          <w:b/>
+          <w:i w:val="0"/>
+          <w:color w:val="0F172A"/>
+          <w:sz w:val="26"/>
+        </w:rPr>
+        <w:t>Resumen Ejecutivo</w:t>
+      </w:r>
+    </w:p>
+    <w:p>
+      <w:pPr>
+        <w:spacing w:before="0" w:after="240"/>
+        <w:jc w:val="both"/>
+      </w:pPr>
+      <w:r>
+        <w:rPr>
+          <w:rFonts w:ascii="Calibri" w:hAnsi="Calibri"/>
+          <w:b w:val="0"/>
+          <w:i w:val="0"/>
+          <w:color w:val="334155"/>
+          <w:sz w:val="20"/>
+        </w:rPr>
+        <w:t>FacturaMétrica es una solución tecnológica integral de naturaleza B2B2C diseñada para resolver la histórica fricción y sobrecarga documental que experimentan las asesorías contables y sus clientes autónomos en los cierres trimestrales de impuestos. El sistema articula dos componentes sinérgicos: una aplicación móvil ultraligera (PWA) para la captura fotográfica inmediata de tickets y facturas PDF, y un panel web de alta densidad de datos concebido para la gestión contable multi-cliente del despacho. A diferencia de los gestores tradicionales de almacenamiento, FacturaMétrica actúa como un filtro fiscal preventivo en tiempo real mediante visión artificial (OCR) y un motor de reglas sustentado en la Ley del IRPF y los criterios de la Agencia Tributaria (AEAT). Los comprobantes se clasifican automáticamente mediante un semáforo de riesgo (Verde, Amarillo y Rojo) y son enriquecidos contextualmente mediante un Asesor Fiscal Virtual interactivo, permitiendo su validación en un solo clic y su exportación estructurada con cuentas asignadas del Plan General Contable (PGC) hacia los principales softwares ERP del mercado español.</w:t>
+      </w:r>
+    </w:p>
+    <w:p>
+      <w:pPr>
+        <w:spacing w:before="120" w:after="80"/>
+        <w:jc w:val="left"/>
+      </w:pPr>
+      <w:r>
+        <w:rPr>
+          <w:rFonts w:ascii="Calibri" w:hAnsi="Calibri"/>
+          <w:b/>
+          <w:i w:val="0"/>
+          <w:color w:val="0F172A"/>
+          <w:sz w:val="26"/>
+        </w:rPr>
+        <w:t>Executive Abstract</w:t>
+      </w:r>
+    </w:p>
+    <w:p>
+      <w:pPr>
+        <w:spacing w:before="0" w:after="240"/>
+        <w:jc w:val="both"/>
+      </w:pPr>
+      <w:r>
+        <w:rPr>
+          <w:rFonts w:ascii="Calibri" w:hAnsi="Calibri"/>
+          <w:b w:val="0"/>
+          <w:i/>
+          <w:color w:val="475569"/>
+          <w:sz w:val="19"/>
+        </w:rPr>
+        <w:t>FacturaMétrica is a comprehensive B2B2C software solution engineered to eliminate the operational friction and administrative overhead faced by tax accounting consultancies and self-employed professionals during quarterly tax deadlines. The platform consists of two integrated components: a lightweight Progressive Web App (PWA) optimized for instant mobile document capture, and a high-density desktop web dashboard tailored for professional multi-client bookkeeping. Beyond traditional optical scanning tools, FacturaMétrica operates as an intelligent real-time preventive tax filter driven by computer vision (OCR) and a contextual rule engine aligned with Spanish personal income tax regulations (LIRPF). Expenses are categorized through a traffic-light risk model (Green, Yellow, Red) and contextualized on-the-spot by an interactive Virtual Tax Advisor, ensuring one-click accountant validation and direct journal export into major ERP accounting systems.</w:t>
+      </w:r>
+    </w:p>
+    <w:p>
+      <w:pPr>
+        <w:spacing w:before="80" w:after="240"/>
+        <w:jc w:val="left"/>
+      </w:pPr>
+      <w:r>
+        <w:rPr>
+          <w:rFonts w:ascii="Calibri" w:hAnsi="Calibri"/>
+          <w:b/>
+          <w:i w:val="0"/>
+          <w:color w:val="0F172A"/>
+          <w:sz w:val="19"/>
+        </w:rPr>
+        <w:t xml:space="preserve">Palabras Clave / Keywords: </w:t>
+      </w:r>
+      <w:r>
+        <w:rPr>
+          <w:rFonts w:ascii="Calibri" w:hAnsi="Calibri"/>
+          <w:b w:val="0"/>
+          <w:i w:val="0"/>
+          <w:color w:val="2563EB"/>
+          <w:sz w:val="19"/>
+        </w:rPr>
+        <w:t>Desarrollo de Aplicaciones Multiplataforma (DAM), Reconocimiento Óptico de Caracteres (OCR), PWA, FastAPI, React, PostgreSQL, Semáforo Fiscal, Plan General Contable (PGC), Factura Electrónica, LIRPF.</w:t>
+      </w:r>
+    </w:p>
+    <w:p>
+      <w:r>
+        <w:br w:type="page"/>
+      </w:r>
+    </w:p>
+    <w:p>
+      <w:pPr>
+        <w:spacing w:before="240" w:after="280"/>
+        <w:jc w:val="left"/>
+      </w:pPr>
+      <w:r>
+        <w:rPr>
+          <w:rFonts w:ascii="Calibri" w:hAnsi="Calibri"/>
+          <w:b/>
+          <w:i w:val="0"/>
+          <w:color w:val="1E3A8A"/>
+          <w:sz w:val="36"/>
+        </w:rPr>
+        <w:t>Índice General de Contenidos</w:t>
+      </w:r>
+    </w:p>
+    <w:tbl>
+      <w:tblPr>
+        <w:tblW w:type="auto" w:w="0"/>
+        <w:jc w:val="center"/>
+        <w:tblLook w:firstColumn="1" w:firstRow="1" w:lastColumn="0" w:lastRow="0" w:noHBand="0" w:noVBand="1" w:val="04A0"/>
+      </w:tblPr>
+      <w:tblGrid>
+        <w:gridCol w:w="4252"/>
+        <w:gridCol w:w="4252"/>
+      </w:tblGrid>
+      <w:tr>
+        <w:tc>
+          <w:tcPr>
+            <w:tcW w:type="dxa" w:w="8352"/>
+          </w:tcPr>
+          <w:p>
+            <w:pPr>
+              <w:spacing w:after="40"/>
+            </w:pPr>
+            <w:r>
+              <w:rPr>
+                <w:rFonts w:ascii="Calibri" w:hAnsi="Calibri"/>
+                <w:b/>
+                <w:color w:val="0F172A"/>
+                <w:sz w:val="19"/>
+              </w:rPr>
+              <w:t>1. Propuesta Inicial e Introducción</w:t>
+            </w:r>
+          </w:p>
+        </w:tc>
+        <w:tc>
+          <w:tcPr>
+            <w:tcW w:type="dxa" w:w="1008"/>
+          </w:tcPr>
+          <w:p>
+            <w:pPr>
+              <w:spacing w:after="40"/>
+              <w:jc w:val="right"/>
+            </w:pPr>
+            <w:r>
+              <w:rPr>
+                <w:rFonts w:ascii="Calibri" w:hAnsi="Calibri"/>
+                <w:b/>
+                <w:color w:val="2563EB"/>
+                <w:sz w:val="19"/>
+              </w:rPr>
+              <w:t>4</w:t>
+            </w:r>
+          </w:p>
+        </w:tc>
+      </w:tr>
+      <w:tr>
+        <w:tc>
+          <w:tcPr>
+            <w:tcW w:type="dxa" w:w="8352"/>
+          </w:tcPr>
+          <w:p>
+            <w:pPr>
+              <w:spacing w:after="40"/>
+            </w:pPr>
+            <w:r>
+              <w:rPr>
+                <w:rFonts w:ascii="Calibri" w:hAnsi="Calibri"/>
+                <w:color w:val="475569"/>
+                <w:sz w:val="19"/>
+              </w:rPr>
+              <w:t xml:space="preserve">   1.1 Título y Descripción General del Proyecto (Logotipo y Eslogan)</w:t>
+            </w:r>
+          </w:p>
+        </w:tc>
+        <w:tc>
+          <w:tcPr>
+            <w:tcW w:type="dxa" w:w="1008"/>
+          </w:tcPr>
+          <w:p>
+            <w:pPr>
+              <w:spacing w:after="40"/>
+              <w:jc w:val="right"/>
+            </w:pPr>
+            <w:r>
+              <w:rPr>
+                <w:rFonts w:ascii="Calibri" w:hAnsi="Calibri"/>
+                <w:color w:val="64748B"/>
+                <w:sz w:val="19"/>
+              </w:rPr>
+              <w:t>4</w:t>
+            </w:r>
+          </w:p>
+        </w:tc>
+      </w:tr>
+      <w:tr>
+        <w:tc>
+          <w:tcPr>
+            <w:tcW w:type="dxa" w:w="8352"/>
+          </w:tcPr>
+          <w:p>
+            <w:pPr>
+              <w:spacing w:after="40"/>
+            </w:pPr>
+            <w:r>
+              <w:rPr>
+                <w:rFonts w:ascii="Calibri" w:hAnsi="Calibri"/>
+                <w:color w:val="475569"/>
+                <w:sz w:val="19"/>
+              </w:rPr>
+              <w:t xml:space="preserve">   1.2 Identificación del Proyecto, Participantes y Centro Educativo</w:t>
+            </w:r>
+          </w:p>
+        </w:tc>
+        <w:tc>
+          <w:tcPr>
+            <w:tcW w:type="dxa" w:w="1008"/>
+          </w:tcPr>
+          <w:p>
+            <w:pPr>
+              <w:spacing w:after="40"/>
+              <w:jc w:val="right"/>
+            </w:pPr>
+            <w:r>
+              <w:rPr>
+                <w:rFonts w:ascii="Calibri" w:hAnsi="Calibri"/>
+                <w:color w:val="64748B"/>
+                <w:sz w:val="19"/>
+              </w:rPr>
+              <w:t>4</w:t>
+            </w:r>
+          </w:p>
+        </w:tc>
+      </w:tr>
+      <w:tr>
+        <w:tc>
+          <w:tcPr>
+            <w:tcW w:type="dxa" w:w="8352"/>
+          </w:tcPr>
+          <w:p>
+            <w:pPr>
+              <w:spacing w:after="40"/>
+            </w:pPr>
+            <w:r>
+              <w:rPr>
+                <w:rFonts w:ascii="Calibri" w:hAnsi="Calibri"/>
+                <w:color w:val="475569"/>
+                <w:sz w:val="19"/>
+              </w:rPr>
+              <w:t xml:space="preserve">   1.3 Justificación del Proyecto y Objetivos Generales y Específicos</w:t>
+            </w:r>
+          </w:p>
+        </w:tc>
+        <w:tc>
+          <w:tcPr>
+            <w:tcW w:type="dxa" w:w="1008"/>
+          </w:tcPr>
+          <w:p>
+            <w:pPr>
+              <w:spacing w:after="40"/>
+              <w:jc w:val="right"/>
+            </w:pPr>
+            <w:r>
+              <w:rPr>
+                <w:rFonts w:ascii="Calibri" w:hAnsi="Calibri"/>
+                <w:color w:val="64748B"/>
+                <w:sz w:val="19"/>
+              </w:rPr>
+              <w:t>5</w:t>
+            </w:r>
+          </w:p>
+        </w:tc>
+      </w:tr>
+      <w:tr>
+        <w:tc>
+          <w:tcPr>
+            <w:tcW w:type="dxa" w:w="8352"/>
+          </w:tcPr>
+          <w:p>
+            <w:pPr>
+              <w:spacing w:after="40"/>
+            </w:pPr>
+            <w:r>
+              <w:rPr>
+                <w:rFonts w:ascii="Calibri" w:hAnsi="Calibri"/>
+                <w:color w:val="475569"/>
+                <w:sz w:val="19"/>
+              </w:rPr>
+              <w:t xml:space="preserve">   1.4 Contenidos y Aspectos Principales (Subsistema Móvil y Panel Gestor)</w:t>
+            </w:r>
+          </w:p>
+        </w:tc>
+        <w:tc>
+          <w:tcPr>
+            <w:tcW w:type="dxa" w:w="1008"/>
+          </w:tcPr>
+          <w:p>
+            <w:pPr>
+              <w:spacing w:after="40"/>
+              <w:jc w:val="right"/>
+            </w:pPr>
+            <w:r>
+              <w:rPr>
+                <w:rFonts w:ascii="Calibri" w:hAnsi="Calibri"/>
+                <w:color w:val="64748B"/>
+                <w:sz w:val="19"/>
+              </w:rPr>
+              <w:t>6</w:t>
+            </w:r>
+          </w:p>
+        </w:tc>
+      </w:tr>
+      <w:tr>
+        <w:tc>
+          <w:tcPr>
+            <w:tcW w:type="dxa" w:w="8352"/>
+          </w:tcPr>
+          <w:p>
+            <w:pPr>
+              <w:spacing w:after="40"/>
+            </w:pPr>
+            <w:r>
+              <w:rPr>
+                <w:rFonts w:ascii="Calibri" w:hAnsi="Calibri"/>
+                <w:color w:val="475569"/>
+                <w:sz w:val="19"/>
+              </w:rPr>
+              <w:t xml:space="preserve">   1.5 Medios y Arquitectura Técnica Seleccionada</w:t>
+            </w:r>
+          </w:p>
+        </w:tc>
+        <w:tc>
+          <w:tcPr>
+            <w:tcW w:type="dxa" w:w="1008"/>
+          </w:tcPr>
+          <w:p>
+            <w:pPr>
+              <w:spacing w:after="40"/>
+              <w:jc w:val="right"/>
+            </w:pPr>
+            <w:r>
+              <w:rPr>
+                <w:rFonts w:ascii="Calibri" w:hAnsi="Calibri"/>
+                <w:color w:val="64748B"/>
+                <w:sz w:val="19"/>
+              </w:rPr>
+              <w:t>7</w:t>
+            </w:r>
+          </w:p>
+        </w:tc>
+      </w:tr>
+      <w:tr>
+        <w:tc>
+          <w:tcPr>
+            <w:tcW w:type="dxa" w:w="8352"/>
+          </w:tcPr>
+          <w:p>
+            <w:pPr>
+              <w:spacing w:after="40"/>
+            </w:pPr>
+            <w:r>
+              <w:rPr>
+                <w:rFonts w:ascii="Calibri" w:hAnsi="Calibri"/>
+                <w:color w:val="475569"/>
+                <w:sz w:val="19"/>
+              </w:rPr>
+              <w:t xml:space="preserve">   1.6 Relación con los Módulos del Ciclo Formativo DAM</w:t>
+            </w:r>
+          </w:p>
+        </w:tc>
+        <w:tc>
+          <w:tcPr>
+            <w:tcW w:type="dxa" w:w="1008"/>
+          </w:tcPr>
+          <w:p>
+            <w:pPr>
+              <w:spacing w:after="40"/>
+              <w:jc w:val="right"/>
+            </w:pPr>
+            <w:r>
+              <w:rPr>
+                <w:rFonts w:ascii="Calibri" w:hAnsi="Calibri"/>
+                <w:color w:val="64748B"/>
+                <w:sz w:val="19"/>
+              </w:rPr>
+              <w:t>8</w:t>
+            </w:r>
+          </w:p>
+        </w:tc>
+      </w:tr>
+      <w:tr>
+        <w:tc>
+          <w:tcPr>
+            <w:tcW w:type="dxa" w:w="8352"/>
+          </w:tcPr>
+          <w:p>
+            <w:pPr>
+              <w:spacing w:after="40"/>
+            </w:pPr>
+            <w:r>
+              <w:rPr>
+                <w:rFonts w:ascii="Calibri" w:hAnsi="Calibri"/>
+                <w:b/>
+                <w:color w:val="0F172A"/>
+                <w:sz w:val="19"/>
+              </w:rPr>
+              <w:t>2. Fases de Desarrollo del Ciclo de Vida (Metodología Scrum)</w:t>
+            </w:r>
+          </w:p>
+        </w:tc>
+        <w:tc>
+          <w:tcPr>
+            <w:tcW w:type="dxa" w:w="1008"/>
+          </w:tcPr>
+          <w:p>
+            <w:pPr>
+              <w:spacing w:after="40"/>
+              <w:jc w:val="right"/>
+            </w:pPr>
+            <w:r>
+              <w:rPr>
+                <w:rFonts w:ascii="Calibri" w:hAnsi="Calibri"/>
+                <w:b/>
+                <w:color w:val="2563EB"/>
+                <w:sz w:val="19"/>
+              </w:rPr>
+              <w:t>9</w:t>
+            </w:r>
+          </w:p>
+        </w:tc>
+      </w:tr>
+      <w:tr>
+        <w:tc>
+          <w:tcPr>
+            <w:tcW w:type="dxa" w:w="8352"/>
+          </w:tcPr>
+          <w:p>
+            <w:pPr>
+              <w:spacing w:after="40"/>
+            </w:pPr>
+            <w:r>
+              <w:rPr>
+                <w:rFonts w:ascii="Calibri" w:hAnsi="Calibri"/>
+                <w:b/>
+                <w:color w:val="0F172A"/>
+                <w:sz w:val="19"/>
+              </w:rPr>
+              <w:t>3. Fase de Análisis</w:t>
+            </w:r>
+          </w:p>
+        </w:tc>
+        <w:tc>
+          <w:tcPr>
+            <w:tcW w:type="dxa" w:w="1008"/>
+          </w:tcPr>
+          <w:p>
+            <w:pPr>
+              <w:spacing w:after="40"/>
+              <w:jc w:val="right"/>
+            </w:pPr>
+            <w:r>
+              <w:rPr>
+                <w:rFonts w:ascii="Calibri" w:hAnsi="Calibri"/>
+                <w:b/>
+                <w:color w:val="2563EB"/>
+                <w:sz w:val="19"/>
+              </w:rPr>
+              <w:t>10</w:t>
+            </w:r>
+          </w:p>
+        </w:tc>
+      </w:tr>
+      <w:tr>
+        <w:tc>
+          <w:tcPr>
+            <w:tcW w:type="dxa" w:w="8352"/>
+          </w:tcPr>
+          <w:p>
+            <w:pPr>
+              <w:spacing w:after="40"/>
+            </w:pPr>
+            <w:r>
+              <w:rPr>
+                <w:rFonts w:ascii="Calibri" w:hAnsi="Calibri"/>
+                <w:color w:val="475569"/>
+                <w:sz w:val="19"/>
+              </w:rPr>
+              <w:t xml:space="preserve">   3.1 Técnicas de Análisis de Usuario (Design Thinking: Mapa de Empatía)</w:t>
+            </w:r>
+          </w:p>
+        </w:tc>
+        <w:tc>
+          <w:tcPr>
+            <w:tcW w:type="dxa" w:w="1008"/>
+          </w:tcPr>
+          <w:p>
+            <w:pPr>
+              <w:spacing w:after="40"/>
+              <w:jc w:val="right"/>
+            </w:pPr>
+            <w:r>
+              <w:rPr>
+                <w:rFonts w:ascii="Calibri" w:hAnsi="Calibri"/>
+                <w:color w:val="64748B"/>
+                <w:sz w:val="19"/>
+              </w:rPr>
+              <w:t>10</w:t>
+            </w:r>
+          </w:p>
+        </w:tc>
+      </w:tr>
+      <w:tr>
+        <w:tc>
+          <w:tcPr>
+            <w:tcW w:type="dxa" w:w="8352"/>
+          </w:tcPr>
+          <w:p>
+            <w:pPr>
+              <w:spacing w:after="40"/>
+            </w:pPr>
+            <w:r>
+              <w:rPr>
+                <w:rFonts w:ascii="Calibri" w:hAnsi="Calibri"/>
+                <w:color w:val="475569"/>
+                <w:sz w:val="19"/>
+              </w:rPr>
+              <w:t xml:space="preserve">   3.2 Requisitos Funcionales del Sistema (RF-01 a RF-14)</w:t>
+            </w:r>
+          </w:p>
+        </w:tc>
+        <w:tc>
+          <w:tcPr>
+            <w:tcW w:type="dxa" w:w="1008"/>
+          </w:tcPr>
+          <w:p>
+            <w:pPr>
+              <w:spacing w:after="40"/>
+              <w:jc w:val="right"/>
+            </w:pPr>
+            <w:r>
+              <w:rPr>
+                <w:rFonts w:ascii="Calibri" w:hAnsi="Calibri"/>
+                <w:color w:val="64748B"/>
+                <w:sz w:val="19"/>
+              </w:rPr>
+              <w:t>12</w:t>
+            </w:r>
+          </w:p>
+        </w:tc>
+      </w:tr>
+      <w:tr>
+        <w:tc>
+          <w:tcPr>
+            <w:tcW w:type="dxa" w:w="8352"/>
+          </w:tcPr>
+          <w:p>
+            <w:pPr>
+              <w:spacing w:after="40"/>
+            </w:pPr>
+            <w:r>
+              <w:rPr>
+                <w:rFonts w:ascii="Calibri" w:hAnsi="Calibri"/>
+                <w:color w:val="475569"/>
+                <w:sz w:val="19"/>
+              </w:rPr>
+              <w:t xml:space="preserve">   3.3 Requisitos No Funcionales (RNF-01 a RNF-10)</w:t>
+            </w:r>
+          </w:p>
+        </w:tc>
+        <w:tc>
+          <w:tcPr>
+            <w:tcW w:type="dxa" w:w="1008"/>
+          </w:tcPr>
+          <w:p>
+            <w:pPr>
+              <w:spacing w:after="40"/>
+              <w:jc w:val="right"/>
+            </w:pPr>
+            <w:r>
+              <w:rPr>
+                <w:rFonts w:ascii="Calibri" w:hAnsi="Calibri"/>
+                <w:color w:val="64748B"/>
+                <w:sz w:val="19"/>
+              </w:rPr>
+              <w:t>14</w:t>
+            </w:r>
+          </w:p>
+        </w:tc>
+      </w:tr>
+      <w:tr>
+        <w:tc>
+          <w:tcPr>
+            <w:tcW w:type="dxa" w:w="8352"/>
+          </w:tcPr>
+          <w:p>
+            <w:pPr>
+              <w:spacing w:after="40"/>
+            </w:pPr>
+            <w:r>
+              <w:rPr>
+                <w:rFonts w:ascii="Calibri" w:hAnsi="Calibri"/>
+                <w:color w:val="475569"/>
+                <w:sz w:val="19"/>
+              </w:rPr>
+              <w:t xml:space="preserve">   3.4 Diagrama de Flujo de Datos (DFD)</w:t>
+            </w:r>
+          </w:p>
+        </w:tc>
+        <w:tc>
+          <w:tcPr>
+            <w:tcW w:type="dxa" w:w="1008"/>
+          </w:tcPr>
+          <w:p>
+            <w:pPr>
+              <w:spacing w:after="40"/>
+              <w:jc w:val="right"/>
+            </w:pPr>
+            <w:r>
+              <w:rPr>
+                <w:rFonts w:ascii="Calibri" w:hAnsi="Calibri"/>
+                <w:color w:val="64748B"/>
+                <w:sz w:val="19"/>
+              </w:rPr>
+              <w:t>15</w:t>
+            </w:r>
+          </w:p>
+        </w:tc>
+      </w:tr>
+      <w:tr>
+        <w:tc>
+          <w:tcPr>
+            <w:tcW w:type="dxa" w:w="8352"/>
+          </w:tcPr>
+          <w:p>
+            <w:pPr>
+              <w:spacing w:after="40"/>
+            </w:pPr>
+            <w:r>
+              <w:rPr>
+                <w:rFonts w:ascii="Calibri" w:hAnsi="Calibri"/>
+                <w:color w:val="475569"/>
+                <w:sz w:val="19"/>
+              </w:rPr>
+              <w:t xml:space="preserve">   3.5 Diagrama de Flujo de Control (DCF)</w:t>
+            </w:r>
+          </w:p>
+        </w:tc>
+        <w:tc>
+          <w:tcPr>
+            <w:tcW w:type="dxa" w:w="1008"/>
+          </w:tcPr>
+          <w:p>
+            <w:pPr>
+              <w:spacing w:after="40"/>
+              <w:jc w:val="right"/>
+            </w:pPr>
+            <w:r>
+              <w:rPr>
+                <w:rFonts w:ascii="Calibri" w:hAnsi="Calibri"/>
+                <w:color w:val="64748B"/>
+                <w:sz w:val="19"/>
+              </w:rPr>
+              <w:t>16</w:t>
+            </w:r>
+          </w:p>
+        </w:tc>
+      </w:tr>
+      <w:tr>
+        <w:tc>
+          <w:tcPr>
+            <w:tcW w:type="dxa" w:w="8352"/>
+          </w:tcPr>
+          <w:p>
+            <w:pPr>
+              <w:spacing w:after="40"/>
+            </w:pPr>
+            <w:r>
+              <w:rPr>
+                <w:rFonts w:ascii="Calibri" w:hAnsi="Calibri"/>
+                <w:color w:val="475569"/>
+                <w:sz w:val="19"/>
+              </w:rPr>
+              <w:t xml:space="preserve">   3.6 Diagrama de Flujo de Cambio de Estados (DFE)</w:t>
+            </w:r>
+          </w:p>
+        </w:tc>
+        <w:tc>
+          <w:tcPr>
+            <w:tcW w:type="dxa" w:w="1008"/>
+          </w:tcPr>
+          <w:p>
+            <w:pPr>
+              <w:spacing w:after="40"/>
+              <w:jc w:val="right"/>
+            </w:pPr>
+            <w:r>
+              <w:rPr>
+                <w:rFonts w:ascii="Calibri" w:hAnsi="Calibri"/>
+                <w:color w:val="64748B"/>
+                <w:sz w:val="19"/>
+              </w:rPr>
+              <w:t>17</w:t>
+            </w:r>
+          </w:p>
+        </w:tc>
+      </w:tr>
+      <w:tr>
+        <w:tc>
+          <w:tcPr>
+            <w:tcW w:type="dxa" w:w="8352"/>
+          </w:tcPr>
+          <w:p>
+            <w:pPr>
+              <w:spacing w:after="40"/>
+            </w:pPr>
+            <w:r>
+              <w:rPr>
+                <w:rFonts w:ascii="Calibri" w:hAnsi="Calibri"/>
+                <w:color w:val="475569"/>
+                <w:sz w:val="19"/>
+              </w:rPr>
+              <w:t xml:space="preserve">   3.7 Planificación Temporal del Proyecto (Diagrama de Gantt)</w:t>
+            </w:r>
+          </w:p>
+        </w:tc>
+        <w:tc>
+          <w:tcPr>
+            <w:tcW w:type="dxa" w:w="1008"/>
+          </w:tcPr>
+          <w:p>
+            <w:pPr>
+              <w:spacing w:after="40"/>
+              <w:jc w:val="right"/>
+            </w:pPr>
+            <w:r>
+              <w:rPr>
+                <w:rFonts w:ascii="Calibri" w:hAnsi="Calibri"/>
+                <w:color w:val="64748B"/>
+                <w:sz w:val="19"/>
+              </w:rPr>
+              <w:t>18</w:t>
+            </w:r>
+          </w:p>
+        </w:tc>
+      </w:tr>
+      <w:tr>
+        <w:tc>
+          <w:tcPr>
+            <w:tcW w:type="dxa" w:w="8352"/>
+          </w:tcPr>
+          <w:p>
+            <w:pPr>
+              <w:spacing w:after="40"/>
+            </w:pPr>
+            <w:r>
+              <w:rPr>
+                <w:rFonts w:ascii="Calibri" w:hAnsi="Calibri"/>
+                <w:color w:val="475569"/>
+                <w:sz w:val="19"/>
+              </w:rPr>
+              <w:t xml:space="preserve">   3.8 Especificación de Casos de Uso (CU-01 a CU-08)</w:t>
+            </w:r>
+          </w:p>
+        </w:tc>
+        <w:tc>
+          <w:tcPr>
+            <w:tcW w:type="dxa" w:w="1008"/>
+          </w:tcPr>
+          <w:p>
+            <w:pPr>
+              <w:spacing w:after="40"/>
+              <w:jc w:val="right"/>
+            </w:pPr>
+            <w:r>
+              <w:rPr>
+                <w:rFonts w:ascii="Calibri" w:hAnsi="Calibri"/>
+                <w:color w:val="64748B"/>
+                <w:sz w:val="19"/>
+              </w:rPr>
+              <w:t>19</w:t>
+            </w:r>
+          </w:p>
+        </w:tc>
+      </w:tr>
+      <w:tr>
+        <w:tc>
+          <w:tcPr>
+            <w:tcW w:type="dxa" w:w="8352"/>
+          </w:tcPr>
+          <w:p>
+            <w:pPr>
+              <w:spacing w:after="40"/>
+            </w:pPr>
+            <w:r>
+              <w:rPr>
+                <w:rFonts w:ascii="Calibri" w:hAnsi="Calibri"/>
+                <w:b/>
+                <w:color w:val="0F172A"/>
+                <w:sz w:val="19"/>
+              </w:rPr>
+              <w:t>4. Fase de Diseño</w:t>
+            </w:r>
+          </w:p>
+        </w:tc>
+        <w:tc>
+          <w:tcPr>
+            <w:tcW w:type="dxa" w:w="1008"/>
+          </w:tcPr>
+          <w:p>
+            <w:pPr>
+              <w:spacing w:after="40"/>
+              <w:jc w:val="right"/>
+            </w:pPr>
+            <w:r>
+              <w:rPr>
+                <w:rFonts w:ascii="Calibri" w:hAnsi="Calibri"/>
+                <w:b/>
+                <w:color w:val="2563EB"/>
+                <w:sz w:val="19"/>
+              </w:rPr>
+              <w:t>21</w:t>
+            </w:r>
+          </w:p>
+        </w:tc>
+      </w:tr>
+      <w:tr>
+        <w:tc>
+          <w:tcPr>
+            <w:tcW w:type="dxa" w:w="8352"/>
+          </w:tcPr>
+          <w:p>
+            <w:pPr>
+              <w:spacing w:after="40"/>
+            </w:pPr>
+            <w:r>
+              <w:rPr>
+                <w:rFonts w:ascii="Calibri" w:hAnsi="Calibri"/>
+                <w:color w:val="475569"/>
+                <w:sz w:val="19"/>
+              </w:rPr>
+              <w:t xml:space="preserve">   4.1 Diseño Arquitectónico de la Plataforma</w:t>
+            </w:r>
+          </w:p>
+        </w:tc>
+        <w:tc>
+          <w:tcPr>
+            <w:tcW w:type="dxa" w:w="1008"/>
+          </w:tcPr>
+          <w:p>
+            <w:pPr>
+              <w:spacing w:after="40"/>
+              <w:jc w:val="right"/>
+            </w:pPr>
+            <w:r>
+              <w:rPr>
+                <w:rFonts w:ascii="Calibri" w:hAnsi="Calibri"/>
+                <w:color w:val="64748B"/>
+                <w:sz w:val="19"/>
+              </w:rPr>
+              <w:t>21</w:t>
+            </w:r>
+          </w:p>
+        </w:tc>
+      </w:tr>
+      <w:tr>
+        <w:tc>
+          <w:tcPr>
+            <w:tcW w:type="dxa" w:w="8352"/>
+          </w:tcPr>
+          <w:p>
+            <w:pPr>
+              <w:spacing w:after="40"/>
+            </w:pPr>
+            <w:r>
+              <w:rPr>
+                <w:rFonts w:ascii="Calibri" w:hAnsi="Calibri"/>
+                <w:color w:val="475569"/>
+                <w:sz w:val="19"/>
+              </w:rPr>
+              <w:t xml:space="preserve">   4.2 Selección y Justificación Tecnológica</w:t>
+            </w:r>
+          </w:p>
+        </w:tc>
+        <w:tc>
+          <w:tcPr>
+            <w:tcW w:type="dxa" w:w="1008"/>
+          </w:tcPr>
+          <w:p>
+            <w:pPr>
+              <w:spacing w:after="40"/>
+              <w:jc w:val="right"/>
+            </w:pPr>
+            <w:r>
+              <w:rPr>
+                <w:rFonts w:ascii="Calibri" w:hAnsi="Calibri"/>
+                <w:color w:val="64748B"/>
+                <w:sz w:val="19"/>
+              </w:rPr>
+              <w:t>22</w:t>
+            </w:r>
+          </w:p>
+        </w:tc>
+      </w:tr>
+      <w:tr>
+        <w:tc>
+          <w:tcPr>
+            <w:tcW w:type="dxa" w:w="8352"/>
+          </w:tcPr>
+          <w:p>
+            <w:pPr>
+              <w:spacing w:after="40"/>
+            </w:pPr>
+            <w:r>
+              <w:rPr>
+                <w:rFonts w:ascii="Calibri" w:hAnsi="Calibri"/>
+                <w:color w:val="475569"/>
+                <w:sz w:val="19"/>
+              </w:rPr>
+              <w:t xml:space="preserve">   4.3 Modelo Conceptual y Diagrama Entidad-Relación (DER)</w:t>
+            </w:r>
+          </w:p>
+        </w:tc>
+        <w:tc>
+          <w:tcPr>
+            <w:tcW w:type="dxa" w:w="1008"/>
+          </w:tcPr>
+          <w:p>
+            <w:pPr>
+              <w:spacing w:after="40"/>
+              <w:jc w:val="right"/>
+            </w:pPr>
+            <w:r>
+              <w:rPr>
+                <w:rFonts w:ascii="Calibri" w:hAnsi="Calibri"/>
+                <w:color w:val="64748B"/>
+                <w:sz w:val="19"/>
+              </w:rPr>
+              <w:t>23</w:t>
+            </w:r>
+          </w:p>
+        </w:tc>
+      </w:tr>
+      <w:tr>
+        <w:tc>
+          <w:tcPr>
+            <w:tcW w:type="dxa" w:w="8352"/>
+          </w:tcPr>
+          <w:p>
+            <w:pPr>
+              <w:spacing w:after="40"/>
+            </w:pPr>
+            <w:r>
+              <w:rPr>
+                <w:rFonts w:ascii="Calibri" w:hAnsi="Calibri"/>
+                <w:b/>
+                <w:color w:val="0F172A"/>
+                <w:sz w:val="19"/>
+              </w:rPr>
+              <w:t>5. Fase de Programación e Implementación</w:t>
+            </w:r>
+          </w:p>
+        </w:tc>
+        <w:tc>
+          <w:tcPr>
+            <w:tcW w:type="dxa" w:w="1008"/>
+          </w:tcPr>
+          <w:p>
+            <w:pPr>
+              <w:spacing w:after="40"/>
+              <w:jc w:val="right"/>
+            </w:pPr>
+            <w:r>
+              <w:rPr>
+                <w:rFonts w:ascii="Calibri" w:hAnsi="Calibri"/>
+                <w:b/>
+                <w:color w:val="2563EB"/>
+                <w:sz w:val="19"/>
+              </w:rPr>
+              <w:t>25</w:t>
+            </w:r>
+          </w:p>
+        </w:tc>
+      </w:tr>
+      <w:tr>
+        <w:tc>
+          <w:tcPr>
+            <w:tcW w:type="dxa" w:w="8352"/>
+          </w:tcPr>
+          <w:p>
+            <w:pPr>
+              <w:spacing w:after="40"/>
+            </w:pPr>
+            <w:r>
+              <w:rPr>
+                <w:rFonts w:ascii="Calibri" w:hAnsi="Calibri"/>
+                <w:color w:val="475569"/>
+                <w:sz w:val="19"/>
+              </w:rPr>
+              <w:t xml:space="preserve">   5.1 Endpoint Backend de Procesamiento Asíncrono de Comprobantes (FastAPI)</w:t>
+            </w:r>
+          </w:p>
+        </w:tc>
+        <w:tc>
+          <w:tcPr>
+            <w:tcW w:type="dxa" w:w="1008"/>
+          </w:tcPr>
+          <w:p>
+            <w:pPr>
+              <w:spacing w:after="40"/>
+              <w:jc w:val="right"/>
+            </w:pPr>
+            <w:r>
+              <w:rPr>
+                <w:rFonts w:ascii="Calibri" w:hAnsi="Calibri"/>
+                <w:color w:val="64748B"/>
+                <w:sz w:val="19"/>
+              </w:rPr>
+              <w:t>25</w:t>
+            </w:r>
+          </w:p>
+        </w:tc>
+      </w:tr>
+      <w:tr>
+        <w:tc>
+          <w:tcPr>
+            <w:tcW w:type="dxa" w:w="8352"/>
+          </w:tcPr>
+          <w:p>
+            <w:pPr>
+              <w:spacing w:after="40"/>
+            </w:pPr>
+            <w:r>
+              <w:rPr>
+                <w:rFonts w:ascii="Calibri" w:hAnsi="Calibri"/>
+                <w:color w:val="475569"/>
+                <w:sz w:val="19"/>
+              </w:rPr>
+              <w:t xml:space="preserve">   5.2 Componente Frontend del Asesor Fiscal Virtual (React / TypeScript)</w:t>
+            </w:r>
+          </w:p>
+        </w:tc>
+        <w:tc>
+          <w:tcPr>
+            <w:tcW w:type="dxa" w:w="1008"/>
+          </w:tcPr>
+          <w:p>
+            <w:pPr>
+              <w:spacing w:after="40"/>
+              <w:jc w:val="right"/>
+            </w:pPr>
+            <w:r>
+              <w:rPr>
+                <w:rFonts w:ascii="Calibri" w:hAnsi="Calibri"/>
+                <w:color w:val="64748B"/>
+                <w:sz w:val="19"/>
+              </w:rPr>
+              <w:t>26</w:t>
+            </w:r>
+          </w:p>
+        </w:tc>
+      </w:tr>
+      <w:tr>
+        <w:tc>
+          <w:tcPr>
+            <w:tcW w:type="dxa" w:w="8352"/>
+          </w:tcPr>
+          <w:p>
+            <w:pPr>
+              <w:spacing w:after="40"/>
+            </w:pPr>
+            <w:r>
+              <w:rPr>
+                <w:rFonts w:ascii="Calibri" w:hAnsi="Calibri"/>
+                <w:b/>
+                <w:color w:val="0F172A"/>
+                <w:sz w:val="19"/>
+              </w:rPr>
+              <w:t>6. Fase de Pruebas y Control de Calidad</w:t>
+            </w:r>
+          </w:p>
+        </w:tc>
+        <w:tc>
+          <w:tcPr>
+            <w:tcW w:type="dxa" w:w="1008"/>
+          </w:tcPr>
+          <w:p>
+            <w:pPr>
+              <w:spacing w:after="40"/>
+              <w:jc w:val="right"/>
+            </w:pPr>
+            <w:r>
+              <w:rPr>
+                <w:rFonts w:ascii="Calibri" w:hAnsi="Calibri"/>
+                <w:b/>
+                <w:color w:val="2563EB"/>
+                <w:sz w:val="19"/>
+              </w:rPr>
+              <w:t>28</w:t>
+            </w:r>
+          </w:p>
+        </w:tc>
+      </w:tr>
+      <w:tr>
+        <w:tc>
+          <w:tcPr>
+            <w:tcW w:type="dxa" w:w="8352"/>
+          </w:tcPr>
+          <w:p>
+            <w:pPr>
+              <w:spacing w:after="40"/>
+            </w:pPr>
+            <w:r>
+              <w:rPr>
+                <w:rFonts w:ascii="Calibri" w:hAnsi="Calibri"/>
+                <w:b/>
+                <w:color w:val="0F172A"/>
+                <w:sz w:val="19"/>
+              </w:rPr>
+              <w:t>7. Fase de Documentación Oficial (Manuales de Usuario, Programador e Instalación)</w:t>
+            </w:r>
+          </w:p>
+        </w:tc>
+        <w:tc>
+          <w:tcPr>
+            <w:tcW w:type="dxa" w:w="1008"/>
+          </w:tcPr>
+          <w:p>
+            <w:pPr>
+              <w:spacing w:after="40"/>
+              <w:jc w:val="right"/>
+            </w:pPr>
+            <w:r>
+              <w:rPr>
+                <w:rFonts w:ascii="Calibri" w:hAnsi="Calibri"/>
+                <w:b/>
+                <w:color w:val="2563EB"/>
+                <w:sz w:val="19"/>
+              </w:rPr>
+              <w:t>29</w:t>
+            </w:r>
+          </w:p>
+        </w:tc>
+      </w:tr>
+      <w:tr>
+        <w:tc>
+          <w:tcPr>
+            <w:tcW w:type="dxa" w:w="8352"/>
+          </w:tcPr>
+          <w:p>
+            <w:pPr>
+              <w:spacing w:after="40"/>
+            </w:pPr>
+            <w:r>
+              <w:rPr>
+                <w:rFonts w:ascii="Calibri" w:hAnsi="Calibri"/>
+                <w:b/>
+                <w:color w:val="0F172A"/>
+                <w:sz w:val="19"/>
+              </w:rPr>
+              <w:t>8. Fase de Implantación y Entorno de Evaluación para el Tribunal</w:t>
+            </w:r>
+          </w:p>
+        </w:tc>
+        <w:tc>
+          <w:tcPr>
+            <w:tcW w:type="dxa" w:w="1008"/>
+          </w:tcPr>
+          <w:p>
+            <w:pPr>
+              <w:spacing w:after="40"/>
+              <w:jc w:val="right"/>
+            </w:pPr>
+            <w:r>
+              <w:rPr>
+                <w:rFonts w:ascii="Calibri" w:hAnsi="Calibri"/>
+                <w:b/>
+                <w:color w:val="2563EB"/>
+                <w:sz w:val="19"/>
+              </w:rPr>
+              <w:t>30</w:t>
+            </w:r>
+          </w:p>
+        </w:tc>
+      </w:tr>
+      <w:tr>
+        <w:tc>
+          <w:tcPr>
+            <w:tcW w:type="dxa" w:w="8352"/>
+          </w:tcPr>
+          <w:p>
+            <w:pPr>
+              <w:spacing w:after="40"/>
+            </w:pPr>
+            <w:r>
+              <w:rPr>
+                <w:rFonts w:ascii="Calibri" w:hAnsi="Calibri"/>
+                <w:b/>
+                <w:color w:val="0F172A"/>
+                <w:sz w:val="19"/>
+              </w:rPr>
+              <w:t>9. Fase de Mantenimiento y Propuestas de Mejora (Veri*Factu, PSD2, IA LLMs)</w:t>
+            </w:r>
+          </w:p>
+        </w:tc>
+        <w:tc>
+          <w:tcPr>
+            <w:tcW w:type="dxa" w:w="1008"/>
+          </w:tcPr>
+          <w:p>
+            <w:pPr>
+              <w:spacing w:after="40"/>
+              <w:jc w:val="right"/>
+            </w:pPr>
+            <w:r>
+              <w:rPr>
+                <w:rFonts w:ascii="Calibri" w:hAnsi="Calibri"/>
+                <w:b/>
+                <w:color w:val="2563EB"/>
+                <w:sz w:val="19"/>
+              </w:rPr>
+              <w:t>31</w:t>
+            </w:r>
+          </w:p>
+        </w:tc>
+      </w:tr>
+      <w:tr>
+        <w:tc>
+          <w:tcPr>
+            <w:tcW w:type="dxa" w:w="8352"/>
+          </w:tcPr>
+          <w:p>
+            <w:pPr>
+              <w:spacing w:after="40"/>
+            </w:pPr>
+            <w:r>
+              <w:rPr>
+                <w:rFonts w:ascii="Calibri" w:hAnsi="Calibri"/>
+                <w:b/>
+                <w:color w:val="0F172A"/>
+                <w:sz w:val="19"/>
+              </w:rPr>
+              <w:t>10. Bibliografía y Normativa Legal de Referencia</w:t>
+            </w:r>
+          </w:p>
+        </w:tc>
+        <w:tc>
+          <w:tcPr>
+            <w:tcW w:type="dxa" w:w="1008"/>
+          </w:tcPr>
+          <w:p>
+            <w:pPr>
+              <w:spacing w:after="40"/>
+              <w:jc w:val="right"/>
+            </w:pPr>
+            <w:r>
+              <w:rPr>
+                <w:rFonts w:ascii="Calibri" w:hAnsi="Calibri"/>
+                <w:b/>
+                <w:color w:val="2563EB"/>
+                <w:sz w:val="19"/>
+              </w:rPr>
+              <w:t>32</w:t>
+            </w:r>
+          </w:p>
+        </w:tc>
+      </w:tr>
+    </w:tbl>
+    <w:p>
+      <w:r>
+        <w:br w:type="page"/>
+      </w:r>
+    </w:p>
     <w:p>
       <w:pPr>
         <w:pStyle w:val="Ttulo1"/>

</xml_diff>

<commit_message>
Añadir el perfil del usuario arquetipo y quitar la imagen del mapa de empatía de la memoria
</commit_message>
<xml_diff>
--- a/Plantila para proyectos EIS Albarregas.docx
+++ b/Plantila para proyectos EIS Albarregas.docx
@@ -7870,54 +7870,200 @@
     </w:p>
     <w:p>
       <w:pPr>
-        <w:jc w:val="center"/>
-      </w:pPr>
-      <w:r>
-        <w:drawing>
-          <wp:inline xmlns:a="http://schemas.openxmlformats.org/drawingml/2006/main" xmlns:pic="http://schemas.openxmlformats.org/drawingml/2006/picture">
-            <wp:extent cx="5669280" cy="4195267"/>
-            <wp:docPr id="2086992324" name="Picture 2086992324"/>
-            <wp:cNvGraphicFramePr>
-              <a:graphicFrameLocks noChangeAspect="1"/>
-            </wp:cNvGraphicFramePr>
-            <a:graphic>
-              <a:graphicData uri="http://schemas.openxmlformats.org/drawingml/2006/picture">
-                <pic:pic>
-                  <pic:nvPicPr>
-                    <pic:cNvPr id="0" name="Mapa_de_empatia_FacturaMetrica.png"/>
-                    <pic:cNvPicPr/>
-                  </pic:nvPicPr>
-                  <pic:blipFill>
-                    <a:blip r:embed="rId19"/>
-                    <a:stretch>
-                      <a:fillRect/>
-                    </a:stretch>
-                  </pic:blipFill>
-                  <pic:spPr>
-                    <a:xfrm>
-                      <a:off x="0" y="0"/>
-                      <a:ext cx="5669280" cy="4195267"/>
-                    </a:xfrm>
-                    <a:prstGeom prst="rect"/>
-                  </pic:spPr>
-                </pic:pic>
-              </a:graphicData>
-            </a:graphic>
-          </wp:inline>
-        </w:drawing>
-      </w:r>
-    </w:p>
-    <w:p>
-      <w:pPr>
-        <w:jc w:val="center"/>
-      </w:pPr>
-      <w:r>
-        <w:rPr>
-          <w:i/>
-          <w:color w:val="64748B"/>
-          <w:sz w:val="19"/>
-        </w:rPr>
-        <w:t>Figura 1: Mapa de Empatía del usuario arquetipo (Autónomo / Contribuyente) para FacturaMétrica.</w:t>
+        <w:jc w:val="left"/>
+      </w:pPr>
+      <w:r>
+        <w:rPr>
+          <w:rFonts w:ascii="Calibri" w:hAnsi="Calibri"/>
+          <w:b/>
+        </w:rPr>
+        <w:t>Perfil del Usuario Arquetipo (Segmentación del Público Objetivo):</w:t>
+      </w:r>
+      <w:r>
+        <w:rPr>
+          <w:rFonts w:ascii="Calibri" w:hAnsi="Calibri"/>
+        </w:rPr>
+        <w:t xml:space="preserve"> como paso previo al mapa de empatía se ha definido el perfil sociodemográfico y psicológico del usuario al que se dirige FacturaMétrica:</w:t>
+      </w:r>
+    </w:p>
+    <w:p>
+      <w:pPr>
+        <w:jc w:val="left"/>
+      </w:pPr>
+      <w:r>
+        <w:rPr>
+          <w:rFonts w:ascii="Calibri" w:hAnsi="Calibri"/>
+          <w:b/>
+        </w:rPr>
+        <w:t>• Nivel económico (status):</w:t>
+      </w:r>
+      <w:r>
+        <w:rPr>
+          <w:rFonts w:ascii="Calibri" w:hAnsi="Calibri"/>
+        </w:rPr>
+        <w:t xml:space="preserve"> Medio–Alto.</w:t>
+      </w:r>
+    </w:p>
+    <w:p>
+      <w:pPr>
+        <w:jc w:val="left"/>
+      </w:pPr>
+      <w:r>
+        <w:rPr>
+          <w:rFonts w:ascii="Calibri" w:hAnsi="Calibri"/>
+          <w:b/>
+        </w:rPr>
+        <w:t>• Tipo de profesión:</w:t>
+      </w:r>
+      <w:r>
+        <w:rPr>
+          <w:rFonts w:ascii="Calibri" w:hAnsi="Calibri"/>
+        </w:rPr>
+        <w:t xml:space="preserve"> Profesionales autónomos de perfiles muy diversos, desde ingenieros hasta camareros y trabajadores de hostelería.</w:t>
+      </w:r>
+    </w:p>
+    <w:p>
+      <w:pPr>
+        <w:jc w:val="left"/>
+      </w:pPr>
+      <w:r>
+        <w:rPr>
+          <w:rFonts w:ascii="Calibri" w:hAnsi="Calibri"/>
+          <w:b/>
+        </w:rPr>
+        <w:t>• Estudio psicológico:</w:t>
+      </w:r>
+      <w:r>
+        <w:rPr>
+          <w:rFonts w:ascii="Calibri" w:hAnsi="Calibri"/>
+        </w:rPr>
+        <w:t xml:space="preserve"> Predominio de la ansiedad asociada a la presión fiscal y a los cierres trimestrales; persona centrada en su actividad profesional.</w:t>
+      </w:r>
+    </w:p>
+    <w:p>
+      <w:pPr>
+        <w:jc w:val="left"/>
+      </w:pPr>
+      <w:r>
+        <w:rPr>
+          <w:rFonts w:ascii="Calibri" w:hAnsi="Calibri"/>
+          <w:b/>
+        </w:rPr>
+        <w:t>• Hobbies:</w:t>
+      </w:r>
+      <w:r>
+        <w:rPr>
+          <w:rFonts w:ascii="Calibri" w:hAnsi="Calibri"/>
+        </w:rPr>
+        <w:t xml:space="preserve"> Música, bingo, videojuegos, deporte, cocina y tecnología.</w:t>
+      </w:r>
+    </w:p>
+    <w:p>
+      <w:pPr>
+        <w:jc w:val="left"/>
+      </w:pPr>
+      <w:r>
+        <w:rPr>
+          <w:rFonts w:ascii="Calibri" w:hAnsi="Calibri"/>
+          <w:b/>
+        </w:rPr>
+        <w:t>• Edad:</w:t>
+      </w:r>
+      <w:r>
+        <w:rPr>
+          <w:rFonts w:ascii="Calibri" w:hAnsi="Calibri"/>
+        </w:rPr>
+        <w:t xml:space="preserve"> Población adulta en edad laboral activa (aprox. 25–55 años).</w:t>
+      </w:r>
+    </w:p>
+    <w:p>
+      <w:pPr>
+        <w:jc w:val="left"/>
+      </w:pPr>
+      <w:r>
+        <w:rPr>
+          <w:rFonts w:ascii="Calibri" w:hAnsi="Calibri"/>
+          <w:b/>
+        </w:rPr>
+        <w:t>• Sexo:</w:t>
+      </w:r>
+      <w:r>
+        <w:rPr>
+          <w:rFonts w:ascii="Calibri" w:hAnsi="Calibri"/>
+        </w:rPr>
+        <w:t xml:space="preserve"> No binario; perfil definido sin distinción de género.</w:t>
+      </w:r>
+    </w:p>
+    <w:p>
+      <w:pPr>
+        <w:jc w:val="left"/>
+      </w:pPr>
+      <w:r>
+        <w:rPr>
+          <w:rFonts w:ascii="Calibri" w:hAnsi="Calibri"/>
+          <w:b/>
+        </w:rPr>
+        <w:t>• Ubicación:</w:t>
+      </w:r>
+      <w:r>
+        <w:rPr>
+          <w:rFonts w:ascii="Calibri" w:hAnsi="Calibri"/>
+        </w:rPr>
+        <w:t xml:space="preserve"> Unión Europea, Estados Unidos y Latinoamérica.</w:t>
+      </w:r>
+    </w:p>
+    <w:p>
+      <w:pPr>
+        <w:jc w:val="left"/>
+      </w:pPr>
+      <w:r>
+        <w:rPr>
+          <w:rFonts w:ascii="Calibri" w:hAnsi="Calibri"/>
+          <w:b/>
+        </w:rPr>
+        <w:t>• Idioma:</w:t>
+      </w:r>
+      <w:r>
+        <w:rPr>
+          <w:rFonts w:ascii="Calibri" w:hAnsi="Calibri"/>
+        </w:rPr>
+        <w:t xml:space="preserve"> Inglés y español.</w:t>
+      </w:r>
+    </w:p>
+    <w:p>
+      <w:pPr>
+        <w:jc w:val="left"/>
+      </w:pPr>
+      <w:r>
+        <w:rPr>
+          <w:rFonts w:ascii="Calibri" w:hAnsi="Calibri"/>
+          <w:b/>
+        </w:rPr>
+        <w:t>• Estado civil:</w:t>
+      </w:r>
+      <w:r>
+        <w:rPr>
+          <w:rFonts w:ascii="Calibri" w:hAnsi="Calibri"/>
+        </w:rPr>
+        <w:t xml:space="preserve"> Casados.</w:t>
+      </w:r>
+    </w:p>
+    <w:p>
+      <w:pPr>
+        <w:jc w:val="left"/>
+      </w:pPr>
+      <w:r>
+        <w:rPr>
+          <w:rFonts w:ascii="Calibri" w:hAnsi="Calibri"/>
+          <w:b/>
+        </w:rPr>
+        <w:t>• Perfil:</w:t>
+      </w:r>
+      <w:r>
+        <w:rPr>
+          <w:rFonts w:ascii="Calibri" w:hAnsi="Calibri"/>
+        </w:rPr>
+        <w:t xml:space="preserve"> Profesional.</w:t>
       </w:r>
     </w:p>
     <w:p>

</xml_diff>